<commit_message>
Switch the spell checker off and give new documents Word's defaults
- editor-core: asc_setSpellCheck(false) once the document is shown (word/api.js; web-apps sets it
  at the same point, documenteditor/mobile Main.jsx). Spell checking needs the Document Server's
  dictionary service; without it every word was underlined red, as the first screenshots showed.
- ooxml: documents get word/styles.xml with the defaults of a new Word document (Calibri 11 pt,
  8 pt after, 1.08 lines, German); without it they fell back to Times New Roman. The engine
  draws Calibri with Carlito from its core fonts. Checked with x2t: the round trip keeps them.
- test-files regenerated.

Co-Authored-By: Claude Opus 5.5 <noreply@anthropic.com>
Claude-Session: https://claude.ai/code/session_019EQFRvL3TVESMctRXTvjbh
</commit_message>
<xml_diff>
--- a/test-files/angebot.docx
+++ b/test-files/angebot.docx
@@ -136,4 +136,28 @@
     </w:sectPr>
   </w:body>
 </w:document>
+</file>
+
+<file path=word/styles.xml><?xml version="1.0" encoding="utf-8"?>
+<w:styles xmlns:w="http://schemas.openxmlformats.org/wordprocessingml/2006/main">
+  <w:docDefaults>
+    <w:rPrDefault>
+      <w:rPr>
+        <w:rFonts w:ascii="Calibri" w:hAnsi="Calibri" w:eastAsia="Calibri" w:cs="Calibri"/>
+        <w:sz w:val="22"/>
+        <w:szCs w:val="22"/>
+        <w:lang w:val="de-DE" w:eastAsia="en-US" w:bidi="ar-SA"/>
+      </w:rPr>
+    </w:rPrDefault>
+    <w:pPrDefault>
+      <w:pPr>
+        <w:spacing w:after="160" w:line="259" w:lineRule="auto"/>
+      </w:pPr>
+    </w:pPrDefault>
+  </w:docDefaults>
+  <w:style w:type="paragraph" w:default="1" w:styleId="Standard">
+    <w:name w:val="Normal"/>
+    <w:qFormat/>
+  </w:style>
+</w:styles>
 </file>
</xml_diff>